<commit_message>
Add published course links
</commit_message>
<xml_diff>
--- a/完整课程链接.docx
+++ b/完整课程链接.docx
@@ -22,7 +22,7 @@
         <w:rPr>
           <w:rFonts w:hint="eastAsia"/>
         </w:rPr>
-        <w:t xml:space="preserve">仓库创建并启用</w:t>
+        <w:t xml:space="preserve">下面是已经上线后的</w:t>
       </w:r>
       <w:r>
         <w:t xml:space="preserve"> GitHub Pages </w:t>
@@ -31,25 +31,7 @@
         <w:rPr>
           <w:rFonts w:hint="eastAsia"/>
         </w:rPr>
-        <w:t xml:space="preserve">后，把下面的</w:t>
-      </w:r>
-      <w:r>
-        <w:t xml:space="preserve"> </w:t>
-      </w:r>
-      <w:r>
-        <w:rPr>
-          <w:rStyle w:val="VerbatimChar"/>
-        </w:rPr>
-        <w:t xml:space="preserve">&lt;repo-pages-base-url&gt;</w:t>
-      </w:r>
-      <w:r>
-        <w:t xml:space="preserve"> </w:t>
-      </w:r>
-      <w:r>
-        <w:rPr>
-          <w:rFonts w:hint="eastAsia"/>
-        </w:rPr>
-        <w:t xml:space="preserve">替换成实际地址。</w:t>
+        <w:t xml:space="preserve">实际地址，可直接分发。</w:t>
       </w:r>
     </w:p>
     <w:p>
@@ -70,7 +52,7 @@
         <w:rPr>
           <w:rStyle w:val="VerbatimChar"/>
         </w:rPr>
-        <w:t xml:space="preserve">&lt;repo-pages-base-url&gt;/</w:t>
+        <w:t xml:space="preserve">https://frankfika.github.io/course-recording-event/</w:t>
       </w:r>
     </w:p>
     <w:p>
@@ -94,7 +76,7 @@
         <w:rPr>
           <w:rStyle w:val="VerbatimChar"/>
         </w:rPr>
-        <w:t xml:space="preserve">&lt;repo-pages-base-url&gt;/C1_chapter1/</w:t>
+        <w:t xml:space="preserve">https://frankfika.github.io/course-recording-event/C1_chapter1/</w:t>
       </w:r>
     </w:p>
     <w:p>
@@ -118,7 +100,7 @@
         <w:rPr>
           <w:rStyle w:val="VerbatimChar"/>
         </w:rPr>
-        <w:t xml:space="preserve">&lt;repo-pages-base-url&gt;/C1_chapter2/</w:t>
+        <w:t xml:space="preserve">https://frankfika.github.io/course-recording-event/C1_chapter2/</w:t>
       </w:r>
     </w:p>
     <w:p>
@@ -142,7 +124,7 @@
         <w:rPr>
           <w:rStyle w:val="VerbatimChar"/>
         </w:rPr>
-        <w:t xml:space="preserve">&lt;repo-pages-base-url&gt;/C1_chapter3/</w:t>
+        <w:t xml:space="preserve">https://frankfika.github.io/course-recording-event/C1_chapter3/</w:t>
       </w:r>
     </w:p>
     <w:p>
@@ -166,7 +148,7 @@
         <w:rPr>
           <w:rStyle w:val="VerbatimChar"/>
         </w:rPr>
-        <w:t xml:space="preserve">&lt;repo-pages-base-url&gt;/C1_chapter4/</w:t>
+        <w:t xml:space="preserve">https://frankfika.github.io/course-recording-event/C1_chapter4/</w:t>
       </w:r>
     </w:p>
     <w:p>
@@ -199,7 +181,7 @@
         <w:rPr>
           <w:rStyle w:val="VerbatimChar"/>
         </w:rPr>
-        <w:t xml:space="preserve">&lt;repo-pages-base-url&gt;/C1_chapter5/</w:t>
+        <w:t xml:space="preserve">https://frankfika.github.io/course-recording-event/C1_chapter5/</w:t>
       </w:r>
     </w:p>
     <w:bookmarkStart w:id="20" w:name="本地目录"/>

</xml_diff>